<commit_message>
Update final report and Phase 6 deliverables notebook
</commit_message>
<xml_diff>
--- a/docs/Healthcare_Insights_Report.docx
+++ b/docs/Healthcare_Insights_Report.docx
@@ -19,7 +19,7 @@
         <w:rPr>
           <w:i/>
         </w:rPr>
-        <w:t>Hospital Operations, Billing Reliability, and Predictive Modeling Summary</w:t>
+        <w:t>Executive Summary for Hospital Operations, Revenue Cycle, AI Deployment, and Governance</w:t>
       </w:r>
     </w:p>
     <w:p>
@@ -27,12 +27,12 @@
         <w:pStyle w:val="Heading1"/>
       </w:pPr>
       <w:r>
-        <w:t>Executive Summary</w:t>
+        <w:t>Executive Overview</w:t>
       </w:r>
     </w:p>
     <w:p>
       <w:r>
-        <w:t>This report summarizes the hospital analytics capstone across SQL reporting, Python EDA, feature engineering, and Phase 3 classification modeling. The analysis covers 5,000 patients, 25,000 visits, and 25,000 billing records. The final modeling table contains 25,000 visit-level rows and 44 columns.</w:t>
+        <w:t>This capstone converts hospital patient, visit, and billing data into an end-to-end analytics and AI decision-support system. The project starts with a governed SQL analytics layer, advances through Python EDA and feature engineering, trains visit-risk and claim-outcome classifiers, validates safety and fairness, deploys models through FastAPI, and adds monitoring for drift and audit traceability.</w:t>
       </w:r>
     </w:p>
     <w:p>
@@ -40,7 +40,7 @@
         <w:pStyle w:val="ListBullet"/>
       </w:pPr>
       <w:r>
-        <w:t>Operational volume is broadly balanced across departments, with General leading at 4,228 visits and ICU lowest at 4,064 visits.</w:t>
+        <w:t>Dataset scale: 5,000 patients, 25,000 visits, 25,000 billing records, and 25,000 model-ready visit rows.</w:t>
       </w:r>
     </w:p>
     <w:p>
@@ -48,7 +48,7 @@
         <w:pStyle w:val="ListBullet"/>
       </w:pPr>
       <w:r>
-        <w:t>Data reliability risk is concentrated in billing fields: 1,318 records are missing approved amount and 790 records are missing payment days.</w:t>
+        <w:t>Primary data reliability risks: 1,318 missing approved amounts and 790 missing payment-day values; length of stay has 0 missing records.</w:t>
       </w:r>
     </w:p>
     <w:p>
@@ -56,7 +56,7 @@
         <w:pStyle w:val="ListBullet"/>
       </w:pPr>
       <w:r>
-        <w:t>SecureLife has the highest observed claim rejection rate at 15.69%, making it the first payer candidate for revenue-cycle review.</w:t>
+        <w:t>Highest payer rejection rate: SecureLife at 15.69%.</w:t>
       </w:r>
     </w:p>
     <w:p>
@@ -64,7 +64,15 @@
         <w:pStyle w:val="ListBullet"/>
       </w:pPr>
       <w:r>
-        <w:t>Random Forest models outperform Logistic Regression baselines for both visit-risk and claim-outcome prediction, with macro F1 of 0.3485 and 0.3743, respectively.</w:t>
+        <w:t>Deployment readiness: FastAPI endpoints provide real-time risk and claim predictions with model versioning, input feature hashing, and audit logging.</w:t>
+      </w:r>
+    </w:p>
+    <w:p>
+      <w:pPr>
+        <w:pStyle w:val="ListBullet"/>
+      </w:pPr>
+      <w:r>
+        <w:t>Governance readiness: Phase 6 monitoring reports show 0 failed validation checks, 2 review checks, 0 high-drift features, and 0 moderate-drift features in the baseline run.</w:t>
       </w:r>
     </w:p>
     <w:p>
@@ -72,12 +80,12 @@
         <w:pStyle w:val="Heading1"/>
       </w:pPr>
       <w:r>
-        <w:t>Key Operational Findings</w:t>
+        <w:t>Key Operational and Financial Findings</w:t>
       </w:r>
     </w:p>
     <w:p>
       <w:r>
-        <w:t>The operational profile is stable enough for baseline modeling. Length of stay is complete, department volumes are well distributed, and patient visit frequency can be used as an operational utilization signal. ICU and ER show the highest high-risk visit rates, which supports focused monitoring of capacity, staffing, and escalation workflows.</w:t>
+        <w:t>Operational activity is broadly distributed across departments, which supports cross-department modeling rather than a narrow single-service-line pilot. ICU and ER have the highest high-risk visit rates and should be prioritized for monitoring and workflow review. Billing quality issues are concentrated in approval and payment-delay fields, which directly affects revenue realization and payer follow-up reliability.</w:t>
       </w:r>
     </w:p>
     <w:tbl>
@@ -87,15 +95,15 @@
         <w:tblLook w:firstColumn="1" w:firstRow="1" w:lastColumn="0" w:lastRow="0" w:noHBand="0" w:noVBand="1" w:val="04A0"/>
       </w:tblPr>
       <w:tblGrid>
-        <w:gridCol w:w="2628"/>
-        <w:gridCol w:w="2628"/>
-        <w:gridCol w:w="2628"/>
-        <w:gridCol w:w="2628"/>
+        <w:gridCol w:w="2664"/>
+        <w:gridCol w:w="2664"/>
+        <w:gridCol w:w="2664"/>
+        <w:gridCol w:w="2664"/>
       </w:tblGrid>
       <w:tr>
         <w:tc>
           <w:tcPr>
-            <w:tcW w:type="dxa" w:w="2628"/>
+            <w:tcW w:type="dxa" w:w="2664"/>
           </w:tcPr>
           <w:p>
             <w:r>
@@ -105,7 +113,7 @@
         </w:tc>
         <w:tc>
           <w:tcPr>
-            <w:tcW w:type="dxa" w:w="2628"/>
+            <w:tcW w:type="dxa" w:w="2664"/>
           </w:tcPr>
           <w:p>
             <w:r>
@@ -115,7 +123,7 @@
         </w:tc>
         <w:tc>
           <w:tcPr>
-            <w:tcW w:type="dxa" w:w="2628"/>
+            <w:tcW w:type="dxa" w:w="2664"/>
           </w:tcPr>
           <w:p>
             <w:r>
@@ -125,7 +133,7 @@
         </w:tc>
         <w:tc>
           <w:tcPr>
-            <w:tcW w:type="dxa" w:w="2628"/>
+            <w:tcW w:type="dxa" w:w="2664"/>
           </w:tcPr>
           <w:p>
             <w:r>
@@ -137,7 +145,7 @@
       <w:tr>
         <w:tc>
           <w:tcPr>
-            <w:tcW w:type="dxa" w:w="2628"/>
+            <w:tcW w:type="dxa" w:w="2664"/>
           </w:tcPr>
           <w:p>
             <w:r>
@@ -147,7 +155,7 @@
         </w:tc>
         <w:tc>
           <w:tcPr>
-            <w:tcW w:type="dxa" w:w="2628"/>
+            <w:tcW w:type="dxa" w:w="2664"/>
           </w:tcPr>
           <w:p>
             <w:r>
@@ -157,7 +165,7 @@
         </w:tc>
         <w:tc>
           <w:tcPr>
-            <w:tcW w:type="dxa" w:w="2628"/>
+            <w:tcW w:type="dxa" w:w="2664"/>
           </w:tcPr>
           <w:p>
             <w:r>
@@ -167,7 +175,7 @@
         </w:tc>
         <w:tc>
           <w:tcPr>
-            <w:tcW w:type="dxa" w:w="2628"/>
+            <w:tcW w:type="dxa" w:w="2664"/>
           </w:tcPr>
           <w:p>
             <w:r>
@@ -179,7 +187,7 @@
       <w:tr>
         <w:tc>
           <w:tcPr>
-            <w:tcW w:type="dxa" w:w="2628"/>
+            <w:tcW w:type="dxa" w:w="2664"/>
           </w:tcPr>
           <w:p>
             <w:r>
@@ -189,7 +197,7 @@
         </w:tc>
         <w:tc>
           <w:tcPr>
-            <w:tcW w:type="dxa" w:w="2628"/>
+            <w:tcW w:type="dxa" w:w="2664"/>
           </w:tcPr>
           <w:p>
             <w:r>
@@ -199,7 +207,7 @@
         </w:tc>
         <w:tc>
           <w:tcPr>
-            <w:tcW w:type="dxa" w:w="2628"/>
+            <w:tcW w:type="dxa" w:w="2664"/>
           </w:tcPr>
           <w:p>
             <w:r>
@@ -209,7 +217,7 @@
         </w:tc>
         <w:tc>
           <w:tcPr>
-            <w:tcW w:type="dxa" w:w="2628"/>
+            <w:tcW w:type="dxa" w:w="2664"/>
           </w:tcPr>
           <w:p>
             <w:r>
@@ -221,7 +229,7 @@
       <w:tr>
         <w:tc>
           <w:tcPr>
-            <w:tcW w:type="dxa" w:w="2628"/>
+            <w:tcW w:type="dxa" w:w="2664"/>
           </w:tcPr>
           <w:p>
             <w:r>
@@ -231,7 +239,7 @@
         </w:tc>
         <w:tc>
           <w:tcPr>
-            <w:tcW w:type="dxa" w:w="2628"/>
+            <w:tcW w:type="dxa" w:w="2664"/>
           </w:tcPr>
           <w:p>
             <w:r>
@@ -241,7 +249,7 @@
         </w:tc>
         <w:tc>
           <w:tcPr>
-            <w:tcW w:type="dxa" w:w="2628"/>
+            <w:tcW w:type="dxa" w:w="2664"/>
           </w:tcPr>
           <w:p>
             <w:r>
@@ -251,7 +259,7 @@
         </w:tc>
         <w:tc>
           <w:tcPr>
-            <w:tcW w:type="dxa" w:w="2628"/>
+            <w:tcW w:type="dxa" w:w="2664"/>
           </w:tcPr>
           <w:p>
             <w:r>
@@ -263,7 +271,7 @@
       <w:tr>
         <w:tc>
           <w:tcPr>
-            <w:tcW w:type="dxa" w:w="2628"/>
+            <w:tcW w:type="dxa" w:w="2664"/>
           </w:tcPr>
           <w:p>
             <w:r>
@@ -273,7 +281,7 @@
         </w:tc>
         <w:tc>
           <w:tcPr>
-            <w:tcW w:type="dxa" w:w="2628"/>
+            <w:tcW w:type="dxa" w:w="2664"/>
           </w:tcPr>
           <w:p>
             <w:r>
@@ -283,7 +291,7 @@
         </w:tc>
         <w:tc>
           <w:tcPr>
-            <w:tcW w:type="dxa" w:w="2628"/>
+            <w:tcW w:type="dxa" w:w="2664"/>
           </w:tcPr>
           <w:p>
             <w:r>
@@ -293,7 +301,7 @@
         </w:tc>
         <w:tc>
           <w:tcPr>
-            <w:tcW w:type="dxa" w:w="2628"/>
+            <w:tcW w:type="dxa" w:w="2664"/>
           </w:tcPr>
           <w:p>
             <w:r>
@@ -305,7 +313,7 @@
       <w:tr>
         <w:tc>
           <w:tcPr>
-            <w:tcW w:type="dxa" w:w="2628"/>
+            <w:tcW w:type="dxa" w:w="2664"/>
           </w:tcPr>
           <w:p>
             <w:r>
@@ -315,7 +323,7 @@
         </w:tc>
         <w:tc>
           <w:tcPr>
-            <w:tcW w:type="dxa" w:w="2628"/>
+            <w:tcW w:type="dxa" w:w="2664"/>
           </w:tcPr>
           <w:p>
             <w:r>
@@ -325,7 +333,7 @@
         </w:tc>
         <w:tc>
           <w:tcPr>
-            <w:tcW w:type="dxa" w:w="2628"/>
+            <w:tcW w:type="dxa" w:w="2664"/>
           </w:tcPr>
           <w:p>
             <w:r>
@@ -335,7 +343,7 @@
         </w:tc>
         <w:tc>
           <w:tcPr>
-            <w:tcW w:type="dxa" w:w="2628"/>
+            <w:tcW w:type="dxa" w:w="2664"/>
           </w:tcPr>
           <w:p>
             <w:r>
@@ -347,7 +355,7 @@
       <w:tr>
         <w:tc>
           <w:tcPr>
-            <w:tcW w:type="dxa" w:w="2628"/>
+            <w:tcW w:type="dxa" w:w="2664"/>
           </w:tcPr>
           <w:p>
             <w:r>
@@ -357,7 +365,7 @@
         </w:tc>
         <w:tc>
           <w:tcPr>
-            <w:tcW w:type="dxa" w:w="2628"/>
+            <w:tcW w:type="dxa" w:w="2664"/>
           </w:tcPr>
           <w:p>
             <w:r>
@@ -367,7 +375,7 @@
         </w:tc>
         <w:tc>
           <w:tcPr>
-            <w:tcW w:type="dxa" w:w="2628"/>
+            <w:tcW w:type="dxa" w:w="2664"/>
           </w:tcPr>
           <w:p>
             <w:r>
@@ -377,7 +385,7 @@
         </w:tc>
         <w:tc>
           <w:tcPr>
-            <w:tcW w:type="dxa" w:w="2628"/>
+            <w:tcW w:type="dxa" w:w="2664"/>
           </w:tcPr>
           <w:p>
             <w:r>
@@ -388,40 +396,8 @@
       </w:tr>
     </w:tbl>
     <w:p>
-      <w:pPr>
-        <w:pStyle w:val="Heading1"/>
-      </w:pPr>
       <w:r>
-        <w:t>Key Financial and Data Quality Findings</w:t>
-      </w:r>
-    </w:p>
-    <w:p>
-      <w:r>
-        <w:t>Financial performance analysis shows that revenue realization and claim follow-up depend heavily on approval and payment-delay completeness. The most important reliability issue is missing approved amount, because it weakens revenue-realization estimates and can hide leakage. Missing payment days limits payer-delay analysis and should be treated as a revenue-cycle process gap.</w:t>
-      </w:r>
-    </w:p>
-    <w:p>
-      <w:pPr>
-        <w:pStyle w:val="ListBullet"/>
-      </w:pPr>
-      <w:r>
-        <w:t>Approved amount missingness: 1,318 records (5.27%).</w:t>
-      </w:r>
-    </w:p>
-    <w:p>
-      <w:pPr>
-        <w:pStyle w:val="ListBullet"/>
-      </w:pPr>
-      <w:r>
-        <w:t>Payment days missingness: 790 records (3.16%).</w:t>
-      </w:r>
-    </w:p>
-    <w:p>
-      <w:pPr>
-        <w:pStyle w:val="ListBullet"/>
-      </w:pPr>
-      <w:r>
-        <w:t>Length of stay missingness: 0 records, making it reliable for operations analysis.</w:t>
+        <w:t>Payer reliability summary:</w:t>
       </w:r>
     </w:p>
     <w:tbl>
@@ -431,15 +407,15 @@
         <w:tblLook w:firstColumn="1" w:firstRow="1" w:lastColumn="0" w:lastRow="0" w:noHBand="0" w:noVBand="1" w:val="04A0"/>
       </w:tblPr>
       <w:tblGrid>
-        <w:gridCol w:w="2628"/>
-        <w:gridCol w:w="2628"/>
-        <w:gridCol w:w="2628"/>
-        <w:gridCol w:w="2628"/>
+        <w:gridCol w:w="2664"/>
+        <w:gridCol w:w="2664"/>
+        <w:gridCol w:w="2664"/>
+        <w:gridCol w:w="2664"/>
       </w:tblGrid>
       <w:tr>
         <w:tc>
           <w:tcPr>
-            <w:tcW w:type="dxa" w:w="2628"/>
+            <w:tcW w:type="dxa" w:w="2664"/>
           </w:tcPr>
           <w:p>
             <w:r>
@@ -449,7 +425,7 @@
         </w:tc>
         <w:tc>
           <w:tcPr>
-            <w:tcW w:type="dxa" w:w="2628"/>
+            <w:tcW w:type="dxa" w:w="2664"/>
           </w:tcPr>
           <w:p>
             <w:r>
@@ -459,7 +435,7 @@
         </w:tc>
         <w:tc>
           <w:tcPr>
-            <w:tcW w:type="dxa" w:w="2628"/>
+            <w:tcW w:type="dxa" w:w="2664"/>
           </w:tcPr>
           <w:p>
             <w:r>
@@ -469,7 +445,7 @@
         </w:tc>
         <w:tc>
           <w:tcPr>
-            <w:tcW w:type="dxa" w:w="2628"/>
+            <w:tcW w:type="dxa" w:w="2664"/>
           </w:tcPr>
           <w:p>
             <w:r>
@@ -481,7 +457,7 @@
       <w:tr>
         <w:tc>
           <w:tcPr>
-            <w:tcW w:type="dxa" w:w="2628"/>
+            <w:tcW w:type="dxa" w:w="2664"/>
           </w:tcPr>
           <w:p>
             <w:r>
@@ -491,7 +467,7 @@
         </w:tc>
         <w:tc>
           <w:tcPr>
-            <w:tcW w:type="dxa" w:w="2628"/>
+            <w:tcW w:type="dxa" w:w="2664"/>
           </w:tcPr>
           <w:p>
             <w:r>
@@ -501,7 +477,7 @@
         </w:tc>
         <w:tc>
           <w:tcPr>
-            <w:tcW w:type="dxa" w:w="2628"/>
+            <w:tcW w:type="dxa" w:w="2664"/>
           </w:tcPr>
           <w:p>
             <w:r>
@@ -511,7 +487,7 @@
         </w:tc>
         <w:tc>
           <w:tcPr>
-            <w:tcW w:type="dxa" w:w="2628"/>
+            <w:tcW w:type="dxa" w:w="2664"/>
           </w:tcPr>
           <w:p>
             <w:r>
@@ -523,7 +499,7 @@
       <w:tr>
         <w:tc>
           <w:tcPr>
-            <w:tcW w:type="dxa" w:w="2628"/>
+            <w:tcW w:type="dxa" w:w="2664"/>
           </w:tcPr>
           <w:p>
             <w:r>
@@ -533,7 +509,7 @@
         </w:tc>
         <w:tc>
           <w:tcPr>
-            <w:tcW w:type="dxa" w:w="2628"/>
+            <w:tcW w:type="dxa" w:w="2664"/>
           </w:tcPr>
           <w:p>
             <w:r>
@@ -543,7 +519,7 @@
         </w:tc>
         <w:tc>
           <w:tcPr>
-            <w:tcW w:type="dxa" w:w="2628"/>
+            <w:tcW w:type="dxa" w:w="2664"/>
           </w:tcPr>
           <w:p>
             <w:r>
@@ -553,7 +529,7 @@
         </w:tc>
         <w:tc>
           <w:tcPr>
-            <w:tcW w:type="dxa" w:w="2628"/>
+            <w:tcW w:type="dxa" w:w="2664"/>
           </w:tcPr>
           <w:p>
             <w:r>
@@ -565,7 +541,7 @@
       <w:tr>
         <w:tc>
           <w:tcPr>
-            <w:tcW w:type="dxa" w:w="2628"/>
+            <w:tcW w:type="dxa" w:w="2664"/>
           </w:tcPr>
           <w:p>
             <w:r>
@@ -575,7 +551,7 @@
         </w:tc>
         <w:tc>
           <w:tcPr>
-            <w:tcW w:type="dxa" w:w="2628"/>
+            <w:tcW w:type="dxa" w:w="2664"/>
           </w:tcPr>
           <w:p>
             <w:r>
@@ -585,7 +561,7 @@
         </w:tc>
         <w:tc>
           <w:tcPr>
-            <w:tcW w:type="dxa" w:w="2628"/>
+            <w:tcW w:type="dxa" w:w="2664"/>
           </w:tcPr>
           <w:p>
             <w:r>
@@ -595,7 +571,7 @@
         </w:tc>
         <w:tc>
           <w:tcPr>
-            <w:tcW w:type="dxa" w:w="2628"/>
+            <w:tcW w:type="dxa" w:w="2664"/>
           </w:tcPr>
           <w:p>
             <w:r>
@@ -607,7 +583,7 @@
       <w:tr>
         <w:tc>
           <w:tcPr>
-            <w:tcW w:type="dxa" w:w="2628"/>
+            <w:tcW w:type="dxa" w:w="2664"/>
           </w:tcPr>
           <w:p>
             <w:r>
@@ -617,7 +593,7 @@
         </w:tc>
         <w:tc>
           <w:tcPr>
-            <w:tcW w:type="dxa" w:w="2628"/>
+            <w:tcW w:type="dxa" w:w="2664"/>
           </w:tcPr>
           <w:p>
             <w:r>
@@ -627,7 +603,7 @@
         </w:tc>
         <w:tc>
           <w:tcPr>
-            <w:tcW w:type="dxa" w:w="2628"/>
+            <w:tcW w:type="dxa" w:w="2664"/>
           </w:tcPr>
           <w:p>
             <w:r>
@@ -637,7 +613,7 @@
         </w:tc>
         <w:tc>
           <w:tcPr>
-            <w:tcW w:type="dxa" w:w="2628"/>
+            <w:tcW w:type="dxa" w:w="2664"/>
           </w:tcPr>
           <w:p>
             <w:r>
@@ -657,7 +633,7 @@
     </w:p>
     <w:p>
       <w:r>
-        <w:t>Phase 3 created two deployable classification pipelines. Model A predicts visit risk for operational triage. Model B predicts claim outcome for proactive revenue-risk control. Both workflows use an earliest-80-percent/latest-20-percent time split, which better reflects future production scoring than a random split.</w:t>
+        <w:t>Two model families were built for operational and financial decision support. The visit-risk model predicts Low, Medium, or High visit risk. The claim-outcome model predicts Paid, Pending, or Rejected claims. Models are evaluated with a time-based split to better reflect production use, where historical visits are used to score future activity.</w:t>
       </w:r>
     </w:p>
     <w:tbl>
@@ -667,26 +643,16 @@
         <w:tblLook w:firstColumn="1" w:firstRow="1" w:lastColumn="0" w:lastRow="0" w:noHBand="0" w:noVBand="1" w:val="04A0"/>
       </w:tblPr>
       <w:tblGrid>
-        <w:gridCol w:w="2102"/>
-        <w:gridCol w:w="2102"/>
-        <w:gridCol w:w="2102"/>
-        <w:gridCol w:w="2102"/>
-        <w:gridCol w:w="2102"/>
+        <w:gridCol w:w="2131"/>
+        <w:gridCol w:w="2131"/>
+        <w:gridCol w:w="2131"/>
+        <w:gridCol w:w="2131"/>
+        <w:gridCol w:w="2131"/>
       </w:tblGrid>
       <w:tr>
         <w:tc>
           <w:tcPr>
-            <w:tcW w:type="dxa" w:w="2102"/>
-          </w:tcPr>
-          <w:p>
-            <w:r>
-              <w:t>problem</w:t>
-            </w:r>
-          </w:p>
-        </w:tc>
-        <w:tc>
-          <w:tcPr>
-            <w:tcW w:type="dxa" w:w="2102"/>
+            <w:tcW w:type="dxa" w:w="2131"/>
           </w:tcPr>
           <w:p>
             <w:r>
@@ -696,31 +662,41 @@
         </w:tc>
         <w:tc>
           <w:tcPr>
-            <w:tcW w:type="dxa" w:w="2102"/>
+            <w:tcW w:type="dxa" w:w="2131"/>
           </w:tcPr>
           <w:p>
             <w:r>
-              <w:t>accuracy</w:t>
+              <w:t>test_accuracy</w:t>
             </w:r>
           </w:p>
         </w:tc>
         <w:tc>
           <w:tcPr>
-            <w:tcW w:type="dxa" w:w="2102"/>
+            <w:tcW w:type="dxa" w:w="2131"/>
           </w:tcPr>
           <w:p>
             <w:r>
-              <w:t>macro_f1</w:t>
+              <w:t>test_macro_f1</w:t>
             </w:r>
           </w:p>
         </w:tc>
         <w:tc>
           <w:tcPr>
-            <w:tcW w:type="dxa" w:w="2102"/>
+            <w:tcW w:type="dxa" w:w="2131"/>
           </w:tcPr>
           <w:p>
             <w:r>
-              <w:t>weighted_f1</w:t>
+              <w:t>critical_class</w:t>
+            </w:r>
+          </w:p>
+        </w:tc>
+        <w:tc>
+          <w:tcPr>
+            <w:tcW w:type="dxa" w:w="2131"/>
+          </w:tcPr>
+          <w:p>
+            <w:r>
+              <w:t>critical_class_recall</w:t>
             </w:r>
           </w:p>
         </w:tc>
@@ -728,7 +704,7 @@
       <w:tr>
         <w:tc>
           <w:tcPr>
-            <w:tcW w:type="dxa" w:w="2102"/>
+            <w:tcW w:type="dxa" w:w="2131"/>
           </w:tcPr>
           <w:p>
             <w:r>
@@ -738,69 +714,7 @@
         </w:tc>
         <w:tc>
           <w:tcPr>
-            <w:tcW w:type="dxa" w:w="2102"/>
-          </w:tcPr>
-          <w:p>
-            <w:r>
-              <w:t>logistic_regression</w:t>
-            </w:r>
-          </w:p>
-        </w:tc>
-        <w:tc>
-          <w:tcPr>
-            <w:tcW w:type="dxa" w:w="2102"/>
-          </w:tcPr>
-          <w:p>
-            <w:r>
-              <w:t>0.3142</w:t>
-            </w:r>
-          </w:p>
-        </w:tc>
-        <w:tc>
-          <w:tcPr>
-            <w:tcW w:type="dxa" w:w="2102"/>
-          </w:tcPr>
-          <w:p>
-            <w:r>
-              <w:t>0.3058</w:t>
-            </w:r>
-          </w:p>
-        </w:tc>
-        <w:tc>
-          <w:tcPr>
-            <w:tcW w:type="dxa" w:w="2102"/>
-          </w:tcPr>
-          <w:p>
-            <w:r>
-              <w:t>0.3204</w:t>
-            </w:r>
-          </w:p>
-        </w:tc>
-      </w:tr>
-      <w:tr>
-        <w:tc>
-          <w:tcPr>
-            <w:tcW w:type="dxa" w:w="2102"/>
-          </w:tcPr>
-          <w:p>
-            <w:r>
-              <w:t>risk_model</w:t>
-            </w:r>
-          </w:p>
-        </w:tc>
-        <w:tc>
-          <w:tcPr>
-            <w:tcW w:type="dxa" w:w="2102"/>
-          </w:tcPr>
-          <w:p>
-            <w:r>
-              <w:t>random_forest</w:t>
-            </w:r>
-          </w:p>
-        </w:tc>
-        <w:tc>
-          <w:tcPr>
-            <w:tcW w:type="dxa" w:w="2102"/>
+            <w:tcW w:type="dxa" w:w="2131"/>
           </w:tcPr>
           <w:p>
             <w:r>
@@ -810,7 +724,7 @@
         </w:tc>
         <w:tc>
           <w:tcPr>
-            <w:tcW w:type="dxa" w:w="2102"/>
+            <w:tcW w:type="dxa" w:w="2131"/>
           </w:tcPr>
           <w:p>
             <w:r>
@@ -820,11 +734,21 @@
         </w:tc>
         <w:tc>
           <w:tcPr>
-            <w:tcW w:type="dxa" w:w="2102"/>
+            <w:tcW w:type="dxa" w:w="2131"/>
           </w:tcPr>
           <w:p>
             <w:r>
-              <w:t>0.4013</w:t>
+              <w:t>High</w:t>
+            </w:r>
+          </w:p>
+        </w:tc>
+        <w:tc>
+          <w:tcPr>
+            <w:tcW w:type="dxa" w:w="2131"/>
+          </w:tcPr>
+          <w:p>
+            <w:r>
+              <w:t>0.1261</w:t>
             </w:r>
           </w:p>
         </w:tc>
@@ -832,7 +756,7 @@
       <w:tr>
         <w:tc>
           <w:tcPr>
-            <w:tcW w:type="dxa" w:w="2102"/>
+            <w:tcW w:type="dxa" w:w="2131"/>
           </w:tcPr>
           <w:p>
             <w:r>
@@ -842,69 +766,7 @@
         </w:tc>
         <w:tc>
           <w:tcPr>
-            <w:tcW w:type="dxa" w:w="2102"/>
-          </w:tcPr>
-          <w:p>
-            <w:r>
-              <w:t>logistic_regression</w:t>
-            </w:r>
-          </w:p>
-        </w:tc>
-        <w:tc>
-          <w:tcPr>
-            <w:tcW w:type="dxa" w:w="2102"/>
-          </w:tcPr>
-          <w:p>
-            <w:r>
-              <w:t>0.3526</w:t>
-            </w:r>
-          </w:p>
-        </w:tc>
-        <w:tc>
-          <w:tcPr>
-            <w:tcW w:type="dxa" w:w="2102"/>
-          </w:tcPr>
-          <w:p>
-            <w:r>
-              <w:t>0.3231</w:t>
-            </w:r>
-          </w:p>
-        </w:tc>
-        <w:tc>
-          <w:tcPr>
-            <w:tcW w:type="dxa" w:w="2102"/>
-          </w:tcPr>
-          <w:p>
-            <w:r>
-              <w:t>0.3801</w:t>
-            </w:r>
-          </w:p>
-        </w:tc>
-      </w:tr>
-      <w:tr>
-        <w:tc>
-          <w:tcPr>
-            <w:tcW w:type="dxa" w:w="2102"/>
-          </w:tcPr>
-          <w:p>
-            <w:r>
-              <w:t>claim_model</w:t>
-            </w:r>
-          </w:p>
-        </w:tc>
-        <w:tc>
-          <w:tcPr>
-            <w:tcW w:type="dxa" w:w="2102"/>
-          </w:tcPr>
-          <w:p>
-            <w:r>
-              <w:t>random_forest</w:t>
-            </w:r>
-          </w:p>
-        </w:tc>
-        <w:tc>
-          <w:tcPr>
-            <w:tcW w:type="dxa" w:w="2102"/>
+            <w:tcW w:type="dxa" w:w="2131"/>
           </w:tcPr>
           <w:p>
             <w:r>
@@ -914,7 +776,7 @@
         </w:tc>
         <w:tc>
           <w:tcPr>
-            <w:tcW w:type="dxa" w:w="2102"/>
+            <w:tcW w:type="dxa" w:w="2131"/>
           </w:tcPr>
           <w:p>
             <w:r>
@@ -924,19 +786,93 @@
         </w:tc>
         <w:tc>
           <w:tcPr>
-            <w:tcW w:type="dxa" w:w="2102"/>
+            <w:tcW w:type="dxa" w:w="2131"/>
           </w:tcPr>
           <w:p>
             <w:r>
-              <w:t>0.4525</w:t>
+              <w:t>Rejected</w:t>
+            </w:r>
+          </w:p>
+        </w:tc>
+        <w:tc>
+          <w:tcPr>
+            <w:tcW w:type="dxa" w:w="2131"/>
+          </w:tcPr>
+          <w:p>
+            <w:r>
+              <w:t>0.6044</w:t>
             </w:r>
           </w:p>
         </w:tc>
       </w:tr>
     </w:tbl>
     <w:p>
+      <w:pPr>
+        <w:pStyle w:val="ListBullet"/>
+      </w:pPr>
       <w:r>
-        <w:t>Model interpretation: Random Forest is selected as the current deployable candidate for both tasks. Current performance is useful as a baseline decision-support layer, but not yet a final clinical or financial automation system. The next modeling improvement should add richer diagnosis, procedure, prior authorization, doctor workload, and historical payer-behavior features.</w:t>
+        <w:t>Visit-risk model: High Risk recall is 0.1261; this model should be treated as an early triage signal, not a standalone safety screen.</w:t>
+      </w:r>
+    </w:p>
+    <w:p>
+      <w:pPr>
+        <w:pStyle w:val="ListBullet"/>
+      </w:pPr>
+      <w:r>
+        <w:t>Claim-outcome model: Rejected claim recall is 0.6044; this is the stronger near-term candidate for revenue-cycle prioritization.</w:t>
+      </w:r>
+    </w:p>
+    <w:p>
+      <w:pPr>
+        <w:pStyle w:val="ListBullet"/>
+      </w:pPr>
+      <w:r>
+        <w:t>Random Forest models outperform Logistic Regression baselines, but current macro F1 values show that richer diagnosis, procedure, prior authorization, workload, and payer-history features would be needed for production-grade performance.</w:t>
+      </w:r>
+    </w:p>
+    <w:p>
+      <w:pPr>
+        <w:pStyle w:val="Heading1"/>
+      </w:pPr>
+      <w:r>
+        <w:t>Deployment, Monitoring, and Governance</w:t>
+      </w:r>
+    </w:p>
+    <w:p>
+      <w:r>
+        <w:t>The deployment layer exposes model predictions through FastAPI endpoints for hospital dashboards and internal workflow systems. Requests and responses are validated with Pydantic schemas. Each prediction is logged with timestamp, model version, prediction class, probabilities, audit ID, and input feature hash. Phase 6 adds monitoring for missing values, numeric ranges, unseen categories, feature drift, prediction drift, and audit-log completeness.</w:t>
+      </w:r>
+    </w:p>
+    <w:p>
+      <w:pPr>
+        <w:pStyle w:val="ListBullet"/>
+      </w:pPr>
+      <w:r>
+        <w:t>Architecture: source CSVs -&gt; SQLite analytics layer -&gt; Python feature pipeline -&gt; model artifacts -&gt; FastAPI prediction service -&gt; monitoring and governance reports.</w:t>
+      </w:r>
+    </w:p>
+    <w:p>
+      <w:pPr>
+        <w:pStyle w:val="ListBullet"/>
+      </w:pPr>
+      <w:r>
+        <w:t>Core endpoints: /health, /predict/risk, /predict/claim, /schema, and /summary.</w:t>
+      </w:r>
+    </w:p>
+    <w:p>
+      <w:pPr>
+        <w:pStyle w:val="ListBullet"/>
+      </w:pPr>
+      <w:r>
+        <w:t>Monitoring outputs: data validation report, feature drift report, prediction drift report, audit log summary, drift detection report, and governance compliance document.</w:t>
+      </w:r>
+    </w:p>
+    <w:p>
+      <w:pPr>
+        <w:pStyle w:val="ListBullet"/>
+      </w:pPr>
+      <w:r>
+        <w:t>Governance position: model outputs should support prioritization and human review, not autonomous clinical or financial decisions.</w:t>
       </w:r>
     </w:p>
     <w:p>
@@ -952,7 +888,7 @@
         <w:pStyle w:val="ListBullet"/>
       </w:pPr>
       <w:r>
-        <w:t>Create a billing data-quality control that requires approved amount and payment days to be completed or explicitly reason-coded before monthly close.</w:t>
+        <w:t>Sponsor a controlled pilot for claim-outcome prediction in the billing team, focused on pre-submission review and rejected-claim prevention.</w:t>
       </w:r>
     </w:p>
     <w:p>
@@ -960,7 +896,7 @@
         <w:pStyle w:val="ListBullet"/>
       </w:pPr>
       <w:r>
-        <w:t>Prioritize payer follow-up for providers with higher rejection rates and longer payment delays, starting with SecureLife based on observed rejection rate.</w:t>
+        <w:t>Use visit-risk predictions only as a secondary triage indicator until High Risk recall improves through richer clinical and operational features.</w:t>
       </w:r>
     </w:p>
     <w:p>
@@ -968,7 +904,7 @@
         <w:pStyle w:val="ListBullet"/>
       </w:pPr>
       <w:r>
-        <w:t>Use the visit-risk model as an early triage screen for capacity planning, not as a standalone clinical decision system.</w:t>
+        <w:t>Create a billing data-quality policy requiring approved amount and payment days to be completed or reason-coded before monthly close.</w:t>
       </w:r>
     </w:p>
     <w:p>
@@ -976,7 +912,7 @@
         <w:pStyle w:val="ListBullet"/>
       </w:pPr>
       <w:r>
-        <w:t>Use the claim-outcome model to rank claims for pre-submission review, especially high-billed claims and claims routed to historically high-rejection payers.</w:t>
+        <w:t>Prioritize payer review for SecureLife due to the highest rejection rate in the current dataset.</w:t>
       </w:r>
     </w:p>
     <w:p>
@@ -984,7 +920,15 @@
         <w:pStyle w:val="ListBullet"/>
       </w:pPr>
       <w:r>
-        <w:t>Deploy the FastAPI scoring package first as an internal pilot, monitor drift monthly, and retrain when payer behavior or department-level risk patterns shift materially.</w:t>
+        <w:t>Adopt monthly monitoring using Phase 6 reports and trigger retraining when drift, payer behavior, or critical-class recall changes materially.</w:t>
+      </w:r>
+    </w:p>
+    <w:p>
+      <w:pPr>
+        <w:pStyle w:val="ListBullet"/>
+      </w:pPr>
+      <w:r>
+        <w:t>Before production rollout, add authentication, log retention rules, dashboard monitoring, model approval workflow, and periodic governance review.</w:t>
       </w:r>
     </w:p>
     <w:p>
@@ -992,7 +936,7 @@
         <w:pStyle w:val="Heading1"/>
       </w:pPr>
       <w:r>
-        <w:t>Deliverable Readiness</w:t>
+        <w:t>Submission Artifacts</w:t>
       </w:r>
     </w:p>
     <w:p>
@@ -1000,7 +944,7 @@
         <w:pStyle w:val="ListBullet"/>
       </w:pPr>
       <w:r>
-        <w:t>EDA notebook includes clean code, plots, quality metrics, and short business insights.</w:t>
+        <w:t>EDA and modeling notebooks: Phase2_EDA.ipynb, Phase3_Modeling.ipynb, Phase4_Evaluation.ipynb.</w:t>
       </w:r>
     </w:p>
     <w:p>
@@ -1008,7 +952,7 @@
         <w:pStyle w:val="ListBullet"/>
       </w:pPr>
       <w:r>
-        <w:t>Feature pipeline writes model_table.csv, feature_schema.json, and drift_summary.csv under data_outputs/.</w:t>
+        <w:t>Deployment package: api/main.py, docs/phase5_deployment_guide.md, docs/api_examples.md.</w:t>
       </w:r>
     </w:p>
     <w:p>
@@ -1016,7 +960,7 @@
         <w:pStyle w:val="ListBullet"/>
       </w:pPr>
       <w:r>
-        <w:t>FastAPI source, deployment runbook, and sample request/response documentation are available in the repository.</w:t>
+        <w:t>Monitoring package: scripts/monitor_phase6.py, docs/phase6/drift_detection_report.md, docs/phase6/governance_compliance.md.</w:t>
       </w:r>
     </w:p>
     <w:p>
@@ -1024,12 +968,12 @@
         <w:pStyle w:val="ListBullet"/>
       </w:pPr>
       <w:r>
-        <w:t>Phase 3 saves model artifacts and a modeling feature schema under model_artifacts/.</w:t>
+        <w:t>Final business report: docs/Healthcare_Insights_Report.docx.</w:t>
       </w:r>
     </w:p>
     <w:sectPr>
       <w:pgSz w:w="12240" w:h="15840"/>
-      <w:pgMar w:top="792" w:right="864" w:bottom="792" w:left="864" w:header="720" w:footer="720" w:gutter="0"/>
+      <w:pgMar w:top="648" w:right="792" w:bottom="648" w:left="792" w:header="720" w:footer="720" w:gutter="0"/>
       <w:cols w:space="720"/>
       <w:docGrid w:linePitch="360"/>
     </w:sectPr>
@@ -1402,7 +1346,7 @@
     <w:rsid w:val="00FC693F"/>
     <w:rPr>
       <w:rFonts w:ascii="Arial" w:hAnsi="Arial"/>
-      <w:sz w:val="19"/>
+      <w:sz w:val="18"/>
     </w:rPr>
   </w:style>
   <w:style w:type="paragraph" w:styleId="Header">

</xml_diff>